<commit_message>
With price check running against WireMock stub
</commit_message>
<xml_diff>
--- a/Build Errors.docx
+++ b/Build Errors.docx
@@ -3,43 +3,66 @@
 <w:document xmlns:wpc="http://schemas.microsoft.com/office/word/2010/wordprocessingCanvas" xmlns:cx="http://schemas.microsoft.com/office/drawing/2014/chartex" xmlns:cx1="http://schemas.microsoft.com/office/drawing/2015/9/8/chartex" xmlns:cx2="http://schemas.microsoft.com/office/drawing/2015/10/21/chartex" xmlns:cx3="http://schemas.microsoft.com/office/drawing/2016/5/9/chartex" xmlns:cx4="http://schemas.microsoft.com/office/drawing/2016/5/10/chartex" xmlns:cx5="http://schemas.microsoft.com/office/drawing/2016/5/11/chartex" xmlns:cx6="http://schemas.microsoft.com/office/drawing/2016/5/12/chartex" xmlns:cx7="http://schemas.microsoft.com/office/drawing/2016/5/13/chartex" xmlns:cx8="http://schemas.microsoft.com/office/drawing/2016/5/14/chartex" xmlns:mc="http://schemas.openxmlformats.org/markup-compatibility/2006" xmlns:aink="http://schemas.microsoft.com/office/drawing/2016/ink" xmlns:am3d="http://schemas.microsoft.com/office/drawing/2017/model3d" xmlns:o="urn:schemas-microsoft-com:office:office" xmlns:oel="http://schemas.microsoft.com/office/2019/extlst" xmlns:r="http://schemas.openxmlformats.org/officeDocument/2006/relationships" xmlns:m="http://schemas.openxmlformats.org/officeDocument/2006/math" xmlns:v="urn:schemas-microsoft-com:vml" xmlns:wp14="http://schemas.microsoft.com/office/word/2010/wordprocessingDrawing" xmlns:wp="http://schemas.openxmlformats.org/drawingml/2006/wordprocessingDrawing" xmlns:w10="urn:schemas-microsoft-com:office:word" xmlns:w="http://schemas.openxmlformats.org/wordprocessingml/2006/main" xmlns:w14="http://schemas.microsoft.com/office/word/2010/wordml" xmlns:w15="http://schemas.microsoft.com/office/word/2012/wordml" xmlns:w16cex="http://schemas.microsoft.com/office/word/2018/wordml/cex" xmlns:w16cid="http://schemas.microsoft.com/office/word/2016/wordml/cid" xmlns:w16="http://schemas.microsoft.com/office/word/2018/wordml" xmlns:w16du="http://schemas.microsoft.com/office/word/2023/wordml/word16du" xmlns:w16sdtdh="http://schemas.microsoft.com/office/word/2020/wordml/sdtdatahash" xmlns:w16sdtfl="http://schemas.microsoft.com/office/word/2024/wordml/sdtformatlock" xmlns:w16se="http://schemas.microsoft.com/office/word/2015/wordml/symex" xmlns:wpg="http://schemas.microsoft.com/office/word/2010/wordprocessingGroup" xmlns:wpi="http://schemas.microsoft.com/office/word/2010/wordprocessingInk" xmlns:wne="http://schemas.microsoft.com/office/word/2006/wordml" xmlns:wps="http://schemas.microsoft.com/office/word/2010/wordprocessingShape" mc:Ignorable="w14 w15 w16se w16cid w16 w16cex w16sdtdh w16sdtfl w16du wp14">
   <w:body>
     <w:p>
+      <w:pPr>
+        <w:rPr>
+          <w:i/>
+          <w:iCs/>
+        </w:rPr>
+      </w:pPr>
       <w:r>
-        <w:drawing>
-          <wp:inline distT="0" distB="0" distL="0" distR="0" wp14:anchorId="430F5146" wp14:editId="561038DA">
-            <wp:extent cx="5943600" cy="434975"/>
-            <wp:effectExtent l="0" t="0" r="0" b="3175"/>
-            <wp:docPr id="1275461555" name="Picture 1"/>
-            <wp:cNvGraphicFramePr>
-              <a:graphicFrameLocks xmlns:a="http://schemas.openxmlformats.org/drawingml/2006/main" noChangeAspect="1"/>
-            </wp:cNvGraphicFramePr>
-            <a:graphic xmlns:a="http://schemas.openxmlformats.org/drawingml/2006/main">
-              <a:graphicData uri="http://schemas.openxmlformats.org/drawingml/2006/picture">
-                <pic:pic xmlns:pic="http://schemas.openxmlformats.org/drawingml/2006/picture">
-                  <pic:nvPicPr>
-                    <pic:cNvPr id="1275461555" name=""/>
-                    <pic:cNvPicPr/>
-                  </pic:nvPicPr>
-                  <pic:blipFill>
-                    <a:blip r:embed="rId4"/>
-                    <a:stretch>
-                      <a:fillRect/>
-                    </a:stretch>
-                  </pic:blipFill>
-                  <pic:spPr>
-                    <a:xfrm>
-                      <a:off x="0" y="0"/>
-                      <a:ext cx="5943600" cy="434975"/>
-                    </a:xfrm>
-                    <a:prstGeom prst="rect">
-                      <a:avLst/>
-                    </a:prstGeom>
-                  </pic:spPr>
-                </pic:pic>
-              </a:graphicData>
-            </a:graphic>
-          </wp:inline>
-        </w:drawing>
+        <w:t xml:space="preserve">Error: </w:t>
       </w:r>
+      <w:r>
+        <w:rPr>
+          <w:i/>
+          <w:iCs/>
+        </w:rPr>
+        <w:t>General error during conversion: Unsupported class file major version 65</w:t>
+      </w:r>
+    </w:p>
+    <w:p/>
+    <w:p>
+      <w:r>
+        <w:t xml:space="preserve">Workaround: </w:t>
+      </w:r>
+    </w:p>
+    <w:p>
+      <w:pPr>
+        <w:pStyle w:val="ListParagraph"/>
+        <w:numPr>
+          <w:ilvl w:val="0"/>
+          <w:numId w:val="2"/>
+        </w:numPr>
+      </w:pPr>
+      <w:r>
+        <w:t>Changed gradle version to 8.5</w:t>
+      </w:r>
+    </w:p>
+    <w:p>
+      <w:pPr>
+        <w:pStyle w:val="ListParagraph"/>
+        <w:numPr>
+          <w:ilvl w:val="0"/>
+          <w:numId w:val="2"/>
+        </w:numPr>
+      </w:pPr>
+      <w:r>
+        <w:t xml:space="preserve">Changed </w:t>
+      </w:r>
+      <w:r>
+        <w:t>JAVA</w:t>
+      </w:r>
+      <w:r>
+        <w:t xml:space="preserve"> version for </w:t>
+      </w:r>
+      <w:r>
+        <w:t>to 18.0.2.1</w:t>
+      </w:r>
+    </w:p>
+    <w:p>
+      <w:pPr>
+        <w:pStyle w:val="ListParagraph"/>
+      </w:pPr>
     </w:p>
     <w:p/>
     <w:p/>
@@ -52,6 +75,241 @@
     </w:sectPr>
   </w:body>
 </w:document>
+</file>
+
+<file path=word/numbering.xml><?xml version="1.0" encoding="utf-8"?>
+<w:numbering xmlns:wpc="http://schemas.microsoft.com/office/word/2010/wordprocessingCanvas" xmlns:cx="http://schemas.microsoft.com/office/drawing/2014/chartex" xmlns:cx1="http://schemas.microsoft.com/office/drawing/2015/9/8/chartex" xmlns:cx2="http://schemas.microsoft.com/office/drawing/2015/10/21/chartex" xmlns:cx3="http://schemas.microsoft.com/office/drawing/2016/5/9/chartex" xmlns:cx4="http://schemas.microsoft.com/office/drawing/2016/5/10/chartex" xmlns:cx5="http://schemas.microsoft.com/office/drawing/2016/5/11/chartex" xmlns:cx6="http://schemas.microsoft.com/office/drawing/2016/5/12/chartex" xmlns:cx7="http://schemas.microsoft.com/office/drawing/2016/5/13/chartex" xmlns:cx8="http://schemas.microsoft.com/office/drawing/2016/5/14/chartex" xmlns:mc="http://schemas.openxmlformats.org/markup-compatibility/2006" xmlns:aink="http://schemas.microsoft.com/office/drawing/2016/ink" xmlns:am3d="http://schemas.microsoft.com/office/drawing/2017/model3d" xmlns:o="urn:schemas-microsoft-com:office:office" xmlns:oel="http://schemas.microsoft.com/office/2019/extlst" xmlns:r="http://schemas.openxmlformats.org/officeDocument/2006/relationships" xmlns:m="http://schemas.openxmlformats.org/officeDocument/2006/math" xmlns:v="urn:schemas-microsoft-com:vml" xmlns:wp14="http://schemas.microsoft.com/office/word/2010/wordprocessingDrawing" xmlns:wp="http://schemas.openxmlformats.org/drawingml/2006/wordprocessingDrawing" xmlns:w10="urn:schemas-microsoft-com:office:word" xmlns:w="http://schemas.openxmlformats.org/wordprocessingml/2006/main" xmlns:w14="http://schemas.microsoft.com/office/word/2010/wordml" xmlns:w15="http://schemas.microsoft.com/office/word/2012/wordml" xmlns:w16cex="http://schemas.microsoft.com/office/word/2018/wordml/cex" xmlns:w16cid="http://schemas.microsoft.com/office/word/2016/wordml/cid" xmlns:w16="http://schemas.microsoft.com/office/word/2018/wordml" xmlns:w16du="http://schemas.microsoft.com/office/word/2023/wordml/word16du" xmlns:w16sdtdh="http://schemas.microsoft.com/office/word/2020/wordml/sdtdatahash" xmlns:w16sdtfl="http://schemas.microsoft.com/office/word/2024/wordml/sdtformatlock" xmlns:w16se="http://schemas.microsoft.com/office/word/2015/wordml/symex" xmlns:wpg="http://schemas.microsoft.com/office/word/2010/wordprocessingGroup" xmlns:wpi="http://schemas.microsoft.com/office/word/2010/wordprocessingInk" xmlns:wne="http://schemas.microsoft.com/office/word/2006/wordml" xmlns:wps="http://schemas.microsoft.com/office/word/2010/wordprocessingShape" mc:Ignorable="w14 w15 w16se w16cid w16 w16cex w16sdtdh w16sdtfl w16du wp14">
+  <w:abstractNum w:abstractNumId="0" w15:restartNumberingAfterBreak="0">
+    <w:nsid w:val="1AE73EB3"/>
+    <w:multiLevelType w:val="hybridMultilevel"/>
+    <w:tmpl w:val="661EE5A6"/>
+    <w:lvl w:ilvl="0" w:tplc="1DDCD204">
+      <w:numFmt w:val="bullet"/>
+      <w:lvlText w:val="-"/>
+      <w:lvlJc w:val="left"/>
+      <w:pPr>
+        <w:ind w:left="720" w:hanging="360"/>
+      </w:pPr>
+      <w:rPr>
+        <w:rFonts w:ascii="Aptos" w:eastAsiaTheme="minorHAnsi" w:hAnsi="Aptos" w:cstheme="minorBidi" w:hint="default"/>
+      </w:rPr>
+    </w:lvl>
+    <w:lvl w:ilvl="1" w:tplc="04090003" w:tentative="1">
+      <w:start w:val="1"/>
+      <w:numFmt w:val="bullet"/>
+      <w:lvlText w:val="o"/>
+      <w:lvlJc w:val="left"/>
+      <w:pPr>
+        <w:ind w:left="1440" w:hanging="360"/>
+      </w:pPr>
+      <w:rPr>
+        <w:rFonts w:ascii="Courier New" w:hAnsi="Courier New" w:cs="Courier New" w:hint="default"/>
+      </w:rPr>
+    </w:lvl>
+    <w:lvl w:ilvl="2" w:tplc="04090005" w:tentative="1">
+      <w:start w:val="1"/>
+      <w:numFmt w:val="bullet"/>
+      <w:lvlText w:val=""/>
+      <w:lvlJc w:val="left"/>
+      <w:pPr>
+        <w:ind w:left="2160" w:hanging="360"/>
+      </w:pPr>
+      <w:rPr>
+        <w:rFonts w:ascii="Wingdings" w:hAnsi="Wingdings" w:hint="default"/>
+      </w:rPr>
+    </w:lvl>
+    <w:lvl w:ilvl="3" w:tplc="04090001" w:tentative="1">
+      <w:start w:val="1"/>
+      <w:numFmt w:val="bullet"/>
+      <w:lvlText w:val=""/>
+      <w:lvlJc w:val="left"/>
+      <w:pPr>
+        <w:ind w:left="2880" w:hanging="360"/>
+      </w:pPr>
+      <w:rPr>
+        <w:rFonts w:ascii="Symbol" w:hAnsi="Symbol" w:hint="default"/>
+      </w:rPr>
+    </w:lvl>
+    <w:lvl w:ilvl="4" w:tplc="04090003" w:tentative="1">
+      <w:start w:val="1"/>
+      <w:numFmt w:val="bullet"/>
+      <w:lvlText w:val="o"/>
+      <w:lvlJc w:val="left"/>
+      <w:pPr>
+        <w:ind w:left="3600" w:hanging="360"/>
+      </w:pPr>
+      <w:rPr>
+        <w:rFonts w:ascii="Courier New" w:hAnsi="Courier New" w:cs="Courier New" w:hint="default"/>
+      </w:rPr>
+    </w:lvl>
+    <w:lvl w:ilvl="5" w:tplc="04090005" w:tentative="1">
+      <w:start w:val="1"/>
+      <w:numFmt w:val="bullet"/>
+      <w:lvlText w:val=""/>
+      <w:lvlJc w:val="left"/>
+      <w:pPr>
+        <w:ind w:left="4320" w:hanging="360"/>
+      </w:pPr>
+      <w:rPr>
+        <w:rFonts w:ascii="Wingdings" w:hAnsi="Wingdings" w:hint="default"/>
+      </w:rPr>
+    </w:lvl>
+    <w:lvl w:ilvl="6" w:tplc="04090001" w:tentative="1">
+      <w:start w:val="1"/>
+      <w:numFmt w:val="bullet"/>
+      <w:lvlText w:val=""/>
+      <w:lvlJc w:val="left"/>
+      <w:pPr>
+        <w:ind w:left="5040" w:hanging="360"/>
+      </w:pPr>
+      <w:rPr>
+        <w:rFonts w:ascii="Symbol" w:hAnsi="Symbol" w:hint="default"/>
+      </w:rPr>
+    </w:lvl>
+    <w:lvl w:ilvl="7" w:tplc="04090003" w:tentative="1">
+      <w:start w:val="1"/>
+      <w:numFmt w:val="bullet"/>
+      <w:lvlText w:val="o"/>
+      <w:lvlJc w:val="left"/>
+      <w:pPr>
+        <w:ind w:left="5760" w:hanging="360"/>
+      </w:pPr>
+      <w:rPr>
+        <w:rFonts w:ascii="Courier New" w:hAnsi="Courier New" w:cs="Courier New" w:hint="default"/>
+      </w:rPr>
+    </w:lvl>
+    <w:lvl w:ilvl="8" w:tplc="04090005" w:tentative="1">
+      <w:start w:val="1"/>
+      <w:numFmt w:val="bullet"/>
+      <w:lvlText w:val=""/>
+      <w:lvlJc w:val="left"/>
+      <w:pPr>
+        <w:ind w:left="6480" w:hanging="360"/>
+      </w:pPr>
+      <w:rPr>
+        <w:rFonts w:ascii="Wingdings" w:hAnsi="Wingdings" w:hint="default"/>
+      </w:rPr>
+    </w:lvl>
+  </w:abstractNum>
+  <w:abstractNum w:abstractNumId="1" w15:restartNumberingAfterBreak="0">
+    <w:nsid w:val="40622638"/>
+    <w:multiLevelType w:val="hybridMultilevel"/>
+    <w:tmpl w:val="154C76A6"/>
+    <w:lvl w:ilvl="0" w:tplc="AFDE6910">
+      <w:numFmt w:val="bullet"/>
+      <w:lvlText w:val="-"/>
+      <w:lvlJc w:val="left"/>
+      <w:pPr>
+        <w:ind w:left="720" w:hanging="360"/>
+      </w:pPr>
+      <w:rPr>
+        <w:rFonts w:ascii="Aptos" w:eastAsiaTheme="minorHAnsi" w:hAnsi="Aptos" w:cstheme="minorBidi" w:hint="default"/>
+      </w:rPr>
+    </w:lvl>
+    <w:lvl w:ilvl="1" w:tplc="04090003" w:tentative="1">
+      <w:start w:val="1"/>
+      <w:numFmt w:val="bullet"/>
+      <w:lvlText w:val="o"/>
+      <w:lvlJc w:val="left"/>
+      <w:pPr>
+        <w:ind w:left="1440" w:hanging="360"/>
+      </w:pPr>
+      <w:rPr>
+        <w:rFonts w:ascii="Courier New" w:hAnsi="Courier New" w:cs="Courier New" w:hint="default"/>
+      </w:rPr>
+    </w:lvl>
+    <w:lvl w:ilvl="2" w:tplc="04090005" w:tentative="1">
+      <w:start w:val="1"/>
+      <w:numFmt w:val="bullet"/>
+      <w:lvlText w:val=""/>
+      <w:lvlJc w:val="left"/>
+      <w:pPr>
+        <w:ind w:left="2160" w:hanging="360"/>
+      </w:pPr>
+      <w:rPr>
+        <w:rFonts w:ascii="Wingdings" w:hAnsi="Wingdings" w:hint="default"/>
+      </w:rPr>
+    </w:lvl>
+    <w:lvl w:ilvl="3" w:tplc="04090001" w:tentative="1">
+      <w:start w:val="1"/>
+      <w:numFmt w:val="bullet"/>
+      <w:lvlText w:val=""/>
+      <w:lvlJc w:val="left"/>
+      <w:pPr>
+        <w:ind w:left="2880" w:hanging="360"/>
+      </w:pPr>
+      <w:rPr>
+        <w:rFonts w:ascii="Symbol" w:hAnsi="Symbol" w:hint="default"/>
+      </w:rPr>
+    </w:lvl>
+    <w:lvl w:ilvl="4" w:tplc="04090003" w:tentative="1">
+      <w:start w:val="1"/>
+      <w:numFmt w:val="bullet"/>
+      <w:lvlText w:val="o"/>
+      <w:lvlJc w:val="left"/>
+      <w:pPr>
+        <w:ind w:left="3600" w:hanging="360"/>
+      </w:pPr>
+      <w:rPr>
+        <w:rFonts w:ascii="Courier New" w:hAnsi="Courier New" w:cs="Courier New" w:hint="default"/>
+      </w:rPr>
+    </w:lvl>
+    <w:lvl w:ilvl="5" w:tplc="04090005" w:tentative="1">
+      <w:start w:val="1"/>
+      <w:numFmt w:val="bullet"/>
+      <w:lvlText w:val=""/>
+      <w:lvlJc w:val="left"/>
+      <w:pPr>
+        <w:ind w:left="4320" w:hanging="360"/>
+      </w:pPr>
+      <w:rPr>
+        <w:rFonts w:ascii="Wingdings" w:hAnsi="Wingdings" w:hint="default"/>
+      </w:rPr>
+    </w:lvl>
+    <w:lvl w:ilvl="6" w:tplc="04090001" w:tentative="1">
+      <w:start w:val="1"/>
+      <w:numFmt w:val="bullet"/>
+      <w:lvlText w:val=""/>
+      <w:lvlJc w:val="left"/>
+      <w:pPr>
+        <w:ind w:left="5040" w:hanging="360"/>
+      </w:pPr>
+      <w:rPr>
+        <w:rFonts w:ascii="Symbol" w:hAnsi="Symbol" w:hint="default"/>
+      </w:rPr>
+    </w:lvl>
+    <w:lvl w:ilvl="7" w:tplc="04090003" w:tentative="1">
+      <w:start w:val="1"/>
+      <w:numFmt w:val="bullet"/>
+      <w:lvlText w:val="o"/>
+      <w:lvlJc w:val="left"/>
+      <w:pPr>
+        <w:ind w:left="5760" w:hanging="360"/>
+      </w:pPr>
+      <w:rPr>
+        <w:rFonts w:ascii="Courier New" w:hAnsi="Courier New" w:cs="Courier New" w:hint="default"/>
+      </w:rPr>
+    </w:lvl>
+    <w:lvl w:ilvl="8" w:tplc="04090005" w:tentative="1">
+      <w:start w:val="1"/>
+      <w:numFmt w:val="bullet"/>
+      <w:lvlText w:val=""/>
+      <w:lvlJc w:val="left"/>
+      <w:pPr>
+        <w:ind w:left="6480" w:hanging="360"/>
+      </w:pPr>
+      <w:rPr>
+        <w:rFonts w:ascii="Wingdings" w:hAnsi="Wingdings" w:hint="default"/>
+      </w:rPr>
+    </w:lvl>
+  </w:abstractNum>
+  <w:num w:numId="1" w16cid:durableId="1104763242">
+    <w:abstractNumId w:val="0"/>
+  </w:num>
+  <w:num w:numId="2" w16cid:durableId="900604047">
+    <w:abstractNumId w:val="1"/>
+  </w:num>
+</w:numbering>
 </file>
 
 <file path=word/styles.xml><?xml version="1.0" encoding="utf-8"?>
@@ -657,7 +915,6 @@
   <w:style w:type="character" w:default="1" w:styleId="DefaultParagraphFont">
     <w:name w:val="Default Paragraph Font"/>
     <w:uiPriority w:val="1"/>
-    <w:semiHidden/>
     <w:unhideWhenUsed/>
   </w:style>
   <w:style w:type="table" w:default="1" w:styleId="TableNormal">

</xml_diff>